<commit_message>
Rename Model.dll and Logic.dll
</commit_message>
<xml_diff>
--- a/Reference/DeviceIdentifier-API-QuickReference.docx
+++ b/Reference/DeviceIdentifier-API-QuickReference.docx
@@ -37,11 +37,65 @@
       <w:pPr>
         <w:spacing w:after="160"/>
       </w:pPr>
+      <w:proofErr w:type="gramStart"/>
       <w:r>
         <w:rPr>
           <w:color w:val="595959"/>
         </w:rPr>
-        <w:t>Model.dll + Logic.dll  ·  .NET 10  ·  Windows x64</w:t>
+        <w:t xml:space="preserve">XenAnalyticDevice.dll </w:t>
+      </w:r>
+      <w:r>
+        <w:rPr>
+          <w:color w:val="595959"/>
+        </w:rPr>
+        <w:t xml:space="preserve"> +</w:t>
+      </w:r>
+      <w:proofErr w:type="gramEnd"/>
+      <w:r>
+        <w:rPr>
+          <w:color w:val="595959"/>
+        </w:rPr>
+        <w:t xml:space="preserve"> </w:t>
+      </w:r>
+      <w:r>
+        <w:rPr>
+          <w:color w:val="595959"/>
+        </w:rPr>
+        <w:t xml:space="preserve">XenAnalyticModel.dll </w:t>
+      </w:r>
+      <w:r>
+        <w:rPr>
+          <w:color w:val="595959"/>
+        </w:rPr>
+        <w:t xml:space="preserve">  </w:t>
+      </w:r>
+      <w:proofErr w:type="gramStart"/>
+      <w:r>
+        <w:rPr>
+          <w:color w:val="595959"/>
+        </w:rPr>
+        <w:t>·  .NET</w:t>
+      </w:r>
+      <w:proofErr w:type="gramEnd"/>
+      <w:r>
+        <w:rPr>
+          <w:color w:val="595959"/>
+        </w:rPr>
+        <w:t xml:space="preserve"> </w:t>
+      </w:r>
+      <w:proofErr w:type="gramStart"/>
+      <w:r>
+        <w:rPr>
+          <w:color w:val="595959"/>
+        </w:rPr>
+        <w:t>10  ·</w:t>
+      </w:r>
+      <w:proofErr w:type="gramEnd"/>
+      <w:r>
+        <w:rPr>
+          <w:color w:val="595959"/>
+        </w:rPr>
+        <w:t xml:space="preserve">  Windows x64</w:t>
       </w:r>
     </w:p>
     <w:p>
@@ -240,11 +294,45 @@
             <w:pPr>
               <w:spacing w:before="20" w:after="20"/>
             </w:pPr>
+            <w:proofErr w:type="gramStart"/>
             <w:r>
               <w:rPr>
                 <w:sz w:val="16"/>
               </w:rPr>
-              <w:t>Logic.dll only (Model.dll comes automatically)</w:t>
+              <w:t xml:space="preserve">XenAnalyticModel.dll </w:t>
+            </w:r>
+            <w:r>
+              <w:rPr>
+                <w:sz w:val="16"/>
+              </w:rPr>
+              <w:t xml:space="preserve"> only</w:t>
+            </w:r>
+            <w:proofErr w:type="gramEnd"/>
+            <w:r>
+              <w:rPr>
+                <w:sz w:val="16"/>
+              </w:rPr>
+              <w:t xml:space="preserve"> (</w:t>
+            </w:r>
+            <w:proofErr w:type="gramStart"/>
+            <w:r>
+              <w:rPr>
+                <w:sz w:val="16"/>
+              </w:rPr>
+              <w:t xml:space="preserve">XenAnalyticDevice.dll </w:t>
+            </w:r>
+            <w:r>
+              <w:rPr>
+                <w:sz w:val="16"/>
+              </w:rPr>
+              <w:t xml:space="preserve"> comes</w:t>
+            </w:r>
+            <w:proofErr w:type="gramEnd"/>
+            <w:r>
+              <w:rPr>
+                <w:sz w:val="16"/>
+              </w:rPr>
+              <w:t xml:space="preserve"> automatically)</w:t>
             </w:r>
           </w:p>
         </w:tc>
@@ -2912,11 +3000,25 @@
             <w:pPr>
               <w:spacing w:before="20" w:after="20"/>
             </w:pPr>
+            <w:proofErr w:type="gramStart"/>
             <w:r>
               <w:rPr>
                 <w:sz w:val="16"/>
               </w:rPr>
-              <w:t>Logic.dll alone fails at load time.</w:t>
+              <w:t xml:space="preserve">XenAnalyticModel.dll </w:t>
+            </w:r>
+            <w:r>
+              <w:rPr>
+                <w:sz w:val="16"/>
+              </w:rPr>
+              <w:t xml:space="preserve"> alone</w:t>
+            </w:r>
+            <w:proofErr w:type="gramEnd"/>
+            <w:r>
+              <w:rPr>
+                <w:sz w:val="16"/>
+              </w:rPr>
+              <w:t xml:space="preserve"> fails at load time.</w:t>
             </w:r>
           </w:p>
         </w:tc>

</xml_diff>